<commit_message>
Fix MLflow port references (5000 -> 5001) and test count in docs
</commit_message>
<xml_diff>
--- a/Heart_Disease_MLOps_Report.docx
+++ b/Heart_Disease_MLOps_Report.docx
@@ -1227,9 +1227,9 @@
           <w:color w:val="333333"/>
           <w:sz w:val="18"/>
         </w:rPr>
-        <w:t>mlflow ui --backend-store-uri ./mlruns</w:t>
+        <w:t>mlflow ui --backend-store-uri ./mlruns --port 5001</w:t>
         <w:br/>
-        <w:t># Open http://localhost:5000</w:t>
+        <w:t># Open http://localhost:5001</w:t>
       </w:r>
     </w:p>
     <w:p>
@@ -1440,7 +1440,7 @@
               <w:rPr>
                 <w:sz w:val="20"/>
               </w:rPr>
-              <w:t>10</w:t>
+              <w:t>9</w:t>
             </w:r>
           </w:p>
         </w:tc>

</xml_diff>

<commit_message>
Fix CI pipeline, add GitHub repo link, add screenshots
</commit_message>
<xml_diff>
--- a/Heart_Disease_MLOps_Report.docx
+++ b/Heart_Disease_MLOps_Report.docx
@@ -2578,7 +2578,23 @@
         <w:rPr>
           <w:color w:val="1A3C6E"/>
         </w:rPr>
-        <w:t>10.3 Conclusion</w:t>
+        <w:t>10.3 Repository Link</w:t>
+      </w:r>
+    </w:p>
+    <w:p>
+      <w:r>
+        <w:t>GitHub: https://github.com/Deepesh-BITsPilani/mlops_heart_disease_assignment</w:t>
+      </w:r>
+    </w:p>
+    <w:p>
+      <w:pPr>
+        <w:pStyle w:val="Heading2"/>
+      </w:pPr>
+      <w:r>
+        <w:rPr>
+          <w:color w:val="1A3C6E"/>
+        </w:rPr>
+        <w:t>10.4 Conclusion</w:t>
       </w:r>
     </w:p>
     <w:p>

</xml_diff>

<commit_message>
Add demo video link, remove mp4 from repo
</commit_message>
<xml_diff>
--- a/Heart_Disease_MLOps_Report.docx
+++ b/Heart_Disease_MLOps_Report.docx
@@ -2594,7 +2594,23 @@
         <w:rPr>
           <w:color w:val="1A3C6E"/>
         </w:rPr>
-        <w:t>10.4 Conclusion</w:t>
+        <w:t>10.4 Demo Video</w:t>
+      </w:r>
+    </w:p>
+    <w:p>
+      <w:r>
+        <w:t>https://drive.google.com/file/d/1kcl4uasG1mN_f0jjZLTgqoPndGuqbrDt/view?usp=sharing</w:t>
+      </w:r>
+    </w:p>
+    <w:p>
+      <w:pPr>
+        <w:pStyle w:val="Heading2"/>
+      </w:pPr>
+      <w:r>
+        <w:rPr>
+          <w:color w:val="1A3C6E"/>
+        </w:rPr>
+        <w:t>10.5 Conclusion</w:t>
       </w:r>
     </w:p>
     <w:p>

</xml_diff>